<commit_message>
Update Week 4 SQLite Data & Engagement Deliverable.docx
</commit_message>
<xml_diff>
--- a/Week 4 SQLite Data & Engagement Deliverable.docx
+++ b/Week 4 SQLite Data & Engagement Deliverable.docx
@@ -288,25 +288,7 @@
           <w:kern w:val="0"/>
           <w14:ligatures w14:val="none"/>
         </w:rPr>
-        <w:t xml:space="preserve"> Is your app successfully </w:t>
-      </w:r>
-      <w:proofErr w:type="gramStart"/>
-      <w:r>
-        <w:rPr>
-          <w:rFonts w:ascii="Times New Roman" w:eastAsia="Times New Roman" w:hAnsi="Times New Roman" w:cs="Times New Roman"/>
-          <w:kern w:val="0"/>
-          <w14:ligatures w14:val="none"/>
-        </w:rPr>
-        <w:t>connecting</w:t>
-      </w:r>
-      <w:proofErr w:type="gramEnd"/>
-      <w:r>
-        <w:rPr>
-          <w:rFonts w:ascii="Times New Roman" w:eastAsia="Times New Roman" w:hAnsi="Times New Roman" w:cs="Times New Roman"/>
-          <w:kern w:val="0"/>
-          <w14:ligatures w14:val="none"/>
-        </w:rPr>
-        <w:t xml:space="preserve"> to </w:t>
+        <w:t xml:space="preserve"> Is your app successfully connecting to </w:t>
       </w:r>
       <w:r>
         <w:rPr>
@@ -820,7 +802,26 @@
           <w:kern w:val="0"/>
           <w14:ligatures w14:val="none"/>
         </w:rPr>
-        <w:t>: [PR Link]</w:t>
+        <w:t>: [</w:t>
+      </w:r>
+      <w:hyperlink r:id="rId6" w:history="1">
+        <w:r>
+          <w:rPr>
+            <w:rStyle w:val="Hyperlink"/>
+            <w:rFonts w:ascii="Times New Roman" w:eastAsia="Times New Roman" w:hAnsi="Times New Roman" w:cs="Times New Roman"/>
+            <w:kern w:val="0"/>
+            <w14:ligatures w14:val="none"/>
+          </w:rPr>
+          <w:t>PR Link</w:t>
+        </w:r>
+      </w:hyperlink>
+      <w:r>
+        <w:rPr>
+          <w:rFonts w:ascii="Times New Roman" w:eastAsia="Times New Roman" w:hAnsi="Times New Roman" w:cs="Times New Roman"/>
+          <w:kern w:val="0"/>
+          <w14:ligatures w14:val="none"/>
+        </w:rPr>
+        <w:t>]</w:t>
       </w:r>
     </w:p>
     <w:p>
@@ -888,7 +889,7 @@
                     <pic:cNvPicPr/>
                   </pic:nvPicPr>
                   <pic:blipFill>
-                    <a:blip r:embed="rId6"/>
+                    <a:blip r:embed="rId7"/>
                     <a:stretch>
                       <a:fillRect/>
                     </a:stretch>
@@ -1096,23 +1097,13 @@
           <w14:ligatures w14:val="none"/>
         </w:rPr>
       </w:pPr>
-      <w:proofErr w:type="gramStart"/>
-      <w:r>
-        <w:rPr>
-          <w:rFonts w:ascii="Times New Roman" w:eastAsia="Times New Roman" w:hAnsi="Times New Roman" w:cs="Times New Roman"/>
-          <w:kern w:val="0"/>
-          <w14:ligatures w14:val="none"/>
-        </w:rPr>
-        <w:t>[ ]</w:t>
-      </w:r>
-      <w:proofErr w:type="gramEnd"/>
-      <w:r>
-        <w:rPr>
-          <w:rFonts w:ascii="Times New Roman" w:eastAsia="Times New Roman" w:hAnsi="Times New Roman" w:cs="Times New Roman"/>
-          <w:kern w:val="0"/>
-          <w14:ligatures w14:val="none"/>
-        </w:rPr>
-        <w:t xml:space="preserve"> Connected the app to a live </w:t>
+      <w:r>
+        <w:rPr>
+          <w:rFonts w:ascii="Times New Roman" w:eastAsia="Times New Roman" w:hAnsi="Times New Roman" w:cs="Times New Roman"/>
+          <w:kern w:val="0"/>
+          <w14:ligatures w14:val="none"/>
+        </w:rPr>
+        <w:t xml:space="preserve">[ ] Connected the app to a live </w:t>
       </w:r>
       <w:r>
         <w:rPr>

</xml_diff>

<commit_message>
Updated info from Densel Aquino
</commit_message>
<xml_diff>
--- a/Week 4 SQLite Data & Engagement Deliverable.docx
+++ b/Week 4 SQLite Data & Engagement Deliverable.docx
@@ -98,15 +98,42 @@
           <w:kern w:val="0"/>
           <w14:ligatures w14:val="none"/>
         </w:rPr>
-        <w:t xml:space="preserve"> [</w:t>
-      </w:r>
-      <w:r>
-        <w:rPr>
-          <w:rFonts w:ascii="Times New Roman" w:eastAsia="Times New Roman" w:hAnsi="Times New Roman" w:cs="Times New Roman"/>
-          <w:kern w:val="0"/>
-          <w14:ligatures w14:val="none"/>
-        </w:rPr>
-        <w:t>Jonathan Le, Densel Aquino</w:t>
+        <w:t xml:space="preserve"> </w:t>
+      </w:r>
+      <w:r>
+        <w:rPr>
+          <w:rFonts w:ascii="Times New Roman" w:eastAsia="Times New Roman" w:hAnsi="Times New Roman" w:cs="Times New Roman"/>
+          <w:color w:val="00B0F0"/>
+          <w:kern w:val="0"/>
+          <w14:ligatures w14:val="none"/>
+        </w:rPr>
+        <w:t>[</w:t>
+      </w:r>
+      <w:r>
+        <w:rPr>
+          <w:rFonts w:ascii="Times New Roman" w:eastAsia="Times New Roman" w:hAnsi="Times New Roman" w:cs="Times New Roman"/>
+          <w:color w:val="00B0F0"/>
+          <w:kern w:val="0"/>
+          <w14:ligatures w14:val="none"/>
+        </w:rPr>
+        <w:t>Jonathan Le</w:t>
+      </w:r>
+      <w:r>
+        <w:rPr>
+          <w:rFonts w:ascii="Times New Roman" w:eastAsia="Times New Roman" w:hAnsi="Times New Roman" w:cs="Times New Roman"/>
+          <w:kern w:val="0"/>
+          <w14:ligatures w14:val="none"/>
+        </w:rPr>
+        <w:t xml:space="preserve">, </w:t>
+      </w:r>
+      <w:r>
+        <w:rPr>
+          <w:rFonts w:ascii="Times New Roman" w:eastAsia="Times New Roman" w:hAnsi="Times New Roman" w:cs="Times New Roman"/>
+          <w:color w:val="4EA72E" w:themeColor="accent6"/>
+          <w:kern w:val="0"/>
+          <w14:ligatures w14:val="none"/>
+        </w:rPr>
+        <w:t>Densel Aquino</w:t>
       </w:r>
       <w:r>
         <w:rPr>
@@ -306,6 +333,23 @@
         </w:rPr>
         <w:t>?</w:t>
       </w:r>
+      <w:r>
+        <w:rPr>
+          <w:rFonts w:ascii="Times New Roman" w:eastAsia="Times New Roman" w:hAnsi="Times New Roman" w:cs="Times New Roman"/>
+          <w:kern w:val="0"/>
+          <w14:ligatures w14:val="none"/>
+        </w:rPr>
+        <w:t xml:space="preserve"> </w:t>
+      </w:r>
+      <w:r>
+        <w:rPr>
+          <w:rFonts w:ascii="Times New Roman" w:eastAsia="Times New Roman" w:hAnsi="Times New Roman" w:cs="Times New Roman"/>
+          <w:color w:val="4EA72E" w:themeColor="accent6"/>
+          <w:kern w:val="0"/>
+          <w14:ligatures w14:val="none"/>
+        </w:rPr>
+        <w:t>Yes</w:t>
+      </w:r>
     </w:p>
     <w:p>
       <w:pPr>
@@ -390,6 +434,23 @@
         </w:rPr>
         <w:t>table? (e.g., fetching a list of items or posting a new map marker).</w:t>
       </w:r>
+      <w:r>
+        <w:rPr>
+          <w:rFonts w:ascii="Times New Roman" w:eastAsia="Times New Roman" w:hAnsi="Times New Roman" w:cs="Times New Roman"/>
+          <w:kern w:val="0"/>
+          <w14:ligatures w14:val="none"/>
+        </w:rPr>
+        <w:t xml:space="preserve"> </w:t>
+      </w:r>
+      <w:r>
+        <w:rPr>
+          <w:rFonts w:ascii="Times New Roman" w:eastAsia="Times New Roman" w:hAnsi="Times New Roman" w:cs="Times New Roman"/>
+          <w:color w:val="4EA72E" w:themeColor="accent6"/>
+          <w:kern w:val="0"/>
+          <w14:ligatures w14:val="none"/>
+        </w:rPr>
+        <w:t xml:space="preserve">Yes, we are reading and writing to a SQLite table. Fetching a list of locations pertaining to the restaurant name. </w:t>
+      </w:r>
     </w:p>
     <w:p>
       <w:pPr>
@@ -665,7 +726,29 @@
           <w:kern w:val="0"/>
           <w14:ligatures w14:val="none"/>
         </w:rPr>
-        <w:t>As the codebase grows more complex with API keys and secrets, focus on security and coordination:</w:t>
+        <w:t xml:space="preserve">As the codebase grows more complex with API keys and secrets, </w:t>
+      </w:r>
+      <w:proofErr w:type="gramStart"/>
+      <w:r>
+        <w:rPr>
+          <w:rFonts w:ascii="Times New Roman" w:eastAsia="Times New Roman" w:hAnsi="Times New Roman" w:cs="Times New Roman"/>
+          <w:i/>
+          <w:iCs/>
+          <w:kern w:val="0"/>
+          <w14:ligatures w14:val="none"/>
+        </w:rPr>
+        <w:t>focus</w:t>
+      </w:r>
+      <w:proofErr w:type="gramEnd"/>
+      <w:r>
+        <w:rPr>
+          <w:rFonts w:ascii="Times New Roman" w:eastAsia="Times New Roman" w:hAnsi="Times New Roman" w:cs="Times New Roman"/>
+          <w:i/>
+          <w:iCs/>
+          <w:kern w:val="0"/>
+          <w14:ligatures w14:val="none"/>
+        </w:rPr>
+        <w:t xml:space="preserve"> on security and coordination:</w:t>
       </w:r>
     </w:p>
     <w:p>
@@ -697,7 +780,25 @@
           <w:kern w:val="0"/>
           <w14:ligatures w14:val="none"/>
         </w:rPr>
-        <w:t xml:space="preserve"> Provide links to the two most significant merges this week:</w:t>
+        <w:t xml:space="preserve"> Provide links to the two most significant </w:t>
+      </w:r>
+      <w:proofErr w:type="gramStart"/>
+      <w:r>
+        <w:rPr>
+          <w:rFonts w:ascii="Times New Roman" w:eastAsia="Times New Roman" w:hAnsi="Times New Roman" w:cs="Times New Roman"/>
+          <w:kern w:val="0"/>
+          <w14:ligatures w14:val="none"/>
+        </w:rPr>
+        <w:t>merges</w:t>
+      </w:r>
+      <w:proofErr w:type="gramEnd"/>
+      <w:r>
+        <w:rPr>
+          <w:rFonts w:ascii="Times New Roman" w:eastAsia="Times New Roman" w:hAnsi="Times New Roman" w:cs="Times New Roman"/>
+          <w:kern w:val="0"/>
+          <w14:ligatures w14:val="none"/>
+        </w:rPr>
+        <w:t xml:space="preserve"> this week:</w:t>
       </w:r>
     </w:p>
     <w:p>
@@ -913,6 +1014,58 @@
     <w:p>
       <w:pPr>
         <w:spacing w:before="100" w:beforeAutospacing="1" w:after="100" w:afterAutospacing="1" w:line="240" w:lineRule="auto"/>
+        <w:rPr>
+          <w:rFonts w:ascii="Times New Roman" w:eastAsia="Times New Roman" w:hAnsi="Times New Roman" w:cs="Times New Roman"/>
+          <w:kern w:val="0"/>
+          <w14:ligatures w14:val="none"/>
+        </w:rPr>
+      </w:pPr>
+      <w:r>
+        <w:rPr>
+          <w:rFonts w:ascii="Times New Roman" w:eastAsia="Times New Roman" w:hAnsi="Times New Roman" w:cs="Times New Roman"/>
+          <w:kern w:val="0"/>
+          <w14:ligatures w14:val="none"/>
+        </w:rPr>
+        <w:drawing>
+          <wp:inline distT="0" distB="0" distL="0" distR="0" wp14:anchorId="00ECC0C6" wp14:editId="17B6E7A5">
+            <wp:extent cx="5943600" cy="1283970"/>
+            <wp:effectExtent l="0" t="0" r="0" b="0"/>
+            <wp:docPr id="310359309" name="Picture 1"/>
+            <wp:cNvGraphicFramePr>
+              <a:graphicFrameLocks xmlns:a="http://schemas.openxmlformats.org/drawingml/2006/main" noChangeAspect="1"/>
+            </wp:cNvGraphicFramePr>
+            <a:graphic xmlns:a="http://schemas.openxmlformats.org/drawingml/2006/main">
+              <a:graphicData uri="http://schemas.openxmlformats.org/drawingml/2006/picture">
+                <pic:pic xmlns:pic="http://schemas.openxmlformats.org/drawingml/2006/picture">
+                  <pic:nvPicPr>
+                    <pic:cNvPr id="310359309" name=""/>
+                    <pic:cNvPicPr/>
+                  </pic:nvPicPr>
+                  <pic:blipFill>
+                    <a:blip r:embed="rId8"/>
+                    <a:stretch>
+                      <a:fillRect/>
+                    </a:stretch>
+                  </pic:blipFill>
+                  <pic:spPr>
+                    <a:xfrm>
+                      <a:off x="0" y="0"/>
+                      <a:ext cx="5943600" cy="1283970"/>
+                    </a:xfrm>
+                    <a:prstGeom prst="rect">
+                      <a:avLst/>
+                    </a:prstGeom>
+                  </pic:spPr>
+                </pic:pic>
+              </a:graphicData>
+            </a:graphic>
+          </wp:inline>
+        </w:drawing>
+      </w:r>
+    </w:p>
+    <w:p>
+      <w:pPr>
+        <w:spacing w:before="100" w:beforeAutospacing="1" w:after="100" w:afterAutospacing="1" w:line="240" w:lineRule="auto"/>
         <w:outlineLvl w:val="1"/>
         <w:rPr>
           <w:rFonts w:ascii="Times New Roman" w:eastAsia="Times New Roman" w:hAnsi="Times New Roman" w:cs="Times New Roman"/>
@@ -1081,7 +1234,25 @@
           <w:kern w:val="0"/>
           <w14:ligatures w14:val="none"/>
         </w:rPr>
-        <w:t>By the end of this week, we have successfully:</w:t>
+        <w:t xml:space="preserve">By the end of this week, we have </w:t>
+      </w:r>
+      <w:proofErr w:type="gramStart"/>
+      <w:r>
+        <w:rPr>
+          <w:rFonts w:ascii="Times New Roman" w:eastAsia="Times New Roman" w:hAnsi="Times New Roman" w:cs="Times New Roman"/>
+          <w:kern w:val="0"/>
+          <w14:ligatures w14:val="none"/>
+        </w:rPr>
+        <w:t>successfully</w:t>
+      </w:r>
+      <w:proofErr w:type="gramEnd"/>
+      <w:r>
+        <w:rPr>
+          <w:rFonts w:ascii="Times New Roman" w:eastAsia="Times New Roman" w:hAnsi="Times New Roman" w:cs="Times New Roman"/>
+          <w:kern w:val="0"/>
+          <w14:ligatures w14:val="none"/>
+        </w:rPr>
+        <w:t>:</w:t>
       </w:r>
     </w:p>
     <w:p>
@@ -1103,7 +1274,33 @@
           <w:kern w:val="0"/>
           <w14:ligatures w14:val="none"/>
         </w:rPr>
-        <w:t xml:space="preserve">[ ] Connected the app to a live </w:t>
+        <w:t>[</w:t>
+      </w:r>
+      <w:proofErr w:type="gramStart"/>
+      <w:r>
+        <w:rPr>
+          <w:rFonts w:ascii="Segoe UI Symbol" w:eastAsia="Times New Roman" w:hAnsi="Segoe UI Symbol" w:cs="Segoe UI Symbol"/>
+          <w:kern w:val="0"/>
+          <w14:ligatures w14:val="none"/>
+        </w:rPr>
+        <w:t>✓</w:t>
+      </w:r>
+      <w:r>
+        <w:rPr>
+          <w:rFonts w:ascii="Times New Roman" w:eastAsia="Times New Roman" w:hAnsi="Times New Roman" w:cs="Times New Roman"/>
+          <w:kern w:val="0"/>
+          <w14:ligatures w14:val="none"/>
+        </w:rPr>
+        <w:t xml:space="preserve"> ]</w:t>
+      </w:r>
+      <w:proofErr w:type="gramEnd"/>
+      <w:r>
+        <w:rPr>
+          <w:rFonts w:ascii="Times New Roman" w:eastAsia="Times New Roman" w:hAnsi="Times New Roman" w:cs="Times New Roman"/>
+          <w:kern w:val="0"/>
+          <w14:ligatures w14:val="none"/>
+        </w:rPr>
+        <w:t xml:space="preserve"> Connected the app to a live </w:t>
       </w:r>
       <w:r>
         <w:rPr>
@@ -2660,6 +2857,7 @@
   <w:style w:type="character" w:default="1" w:styleId="DefaultParagraphFont">
     <w:name w:val="Default Paragraph Font"/>
     <w:uiPriority w:val="1"/>
+    <w:semiHidden/>
     <w:unhideWhenUsed/>
   </w:style>
   <w:style w:type="table" w:default="1" w:styleId="TableNormal">

</xml_diff>